<commit_message>
Bài báo JSRD, danh mục tài liệu APA đã kiểm chứng, cập nhật báo cáo rà soát lượt 5
Co-Authored-By: Claude Opus 5.5 <noreply@anthropic.com>
Claude-Session: https://claude.ai/code/session_01ThGArqDrUUsqC1zG1BQvVL
</commit_message>
<xml_diff>
--- a/Ban_cuoi/Bao_cao_tong_ket_de_tai.docx
+++ b/Ban_cuoi/Bao_cao_tong_ket_de_tai.docx
@@ -14199,7 +14199,7 @@
         <w:rPr>
           <w:szCs w:val="26"/>
         </w:rPr>
-        <w:t>Bảng 2.6 và Hình 2.7 cho thấy danh mục hình thành từ ba luồng. Luồng thương hiệu gồm 4 tài sản, đều do Nhà trường đơn sở hữu và đều đã có văn bằng. Luồng hợp tác doanh nghiệp gồm 5 kiểu dáng công nghiệp và 1 nhãn hiệu đồng sở hữu với một doanh nghiệp đối tác; đây là thành công nổi bật của chiến lược hợp tác đại học với doanh nghiệp mà Ban Giám hiệu đã chủ động kết nối, riêng năm 2024 có 5 kiểu dáng được cấp, nâng số lũy kế từ 4 lên 9 tài sản. Luồng nghiên cứu đã có 2 đơn sáng chế nộp năm 2025 và 2026. Giai đoạn tới, Nhà trường có thể tận dụng đà hợp tác này để phát triển thêm các tài sản do chính Nhà trường đơn sở hữu từ kết quả nghiên cứu, nhất là công thức và quy trình, những đối tượng mà kiểu dáng công nghiệp chưa bảo hộ. Giải pháp hữu ích, loại hình phù hợp nhất với sản phẩm đề tài cấp cơ sở, là hướng phát triển còn bỏ ngỏ.</w:t>
+        <w:t>Bảng 2.6 và Hình 2.7 cho thấy danh mục hình thành từ ba luồng. Luồng thương hiệu gồm 4 tài sản, đều do Nhà trường đơn sở hữu và đều đã có văn bằng. Luồng hợp tác doanh nghiệp gồm 5 kiểu dáng công nghiệp và 1 nhãn hiệu đồng sở hữu với một doanh nghiệp đối tác; đây là thành công nổi bật của chiến lược hợp tác đại học với doanh nghiệp mà Ban Giám hiệu đã dày công kết nối, riêng năm 2024 có 5 kiểu dáng được cấp, nâng số lũy kế từ 4 lên 9 tài sản. Luồng nghiên cứu đã có 2 đơn sáng chế nộp năm 2025 và 2026. Giai đoạn tới, Nhà trường có thể tận dụng đà hợp tác này để phát triển thêm các tài sản do chính Nhà trường đơn sở hữu từ kết quả nghiên cứu, nhất là công thức và quy trình, những đối tượng mà kiểu dáng công nghiệp chưa bảo hộ. Giải pháp hữu ích, loại hình phù hợp nhất với sản phẩm đề tài cấp cơ sở, là hướng phát triển còn bỏ ngỏ.</w:t>
       </w:r>
     </w:p>
     <w:p>
@@ -15897,7 +15897,7 @@
         <w:rPr>
           <w:szCs w:val="26"/>
         </w:rPr>
-        <w:t>Thứ hai, Nhà trường đã xác lập 12 tài sản trí tuệ, trong đó 9 tài sản có văn bằng. Nhóm thương hiệu gồm tên trường, bộ nhận diện và thương hiệu hệ sinh thái được bảo hộ liên tục từ năm 2021. Chiến lược hợp tác với doanh nghiệp do Ban Giám hiệu chủ động kết nối đã tạo ra 5 kiểu dáng công nghiệp và 1 nhãn hiệu đồng sở hữu, minh chứng cho năng lực hợp tác đại học với doanh nghiệp hiệu quả của Nhà trường.</w:t>
+        <w:t>Thứ hai, Nhà trường đã xác lập 12 tài sản trí tuệ, trong đó 9 tài sản có văn bằng. Nhóm thương hiệu gồm tên trường, bộ nhận diện và thương hiệu hệ sinh thái được bảo hộ liên tục từ năm 2021. 5 kiểu dáng công nghiệp và 1 nhãn hiệu đồng sở hữu là thành công nổi bật trong chiến lược hợp tác đại học với doanh nghiệp mà Ban Giám hiệu đã dày công kết nối.</w:t>
       </w:r>
     </w:p>
     <w:p>
@@ -16935,7 +16935,7 @@
               <w:rPr>
                 <w:sz w:val="24"/>
               </w:rPr>
-              <w:t xml:space="preserve"> 2 đơn sáng chế năm 2025 và 2026; 9 văn bằng, trong đó 5 kiểu dáng công nghiệp và nhãn hiệu từ chiến lược hợp tác doanh nghiệp do Ban Giám hiệu chủ động kết nối.</w:t>
+              <w:t xml:space="preserve"> 2 đơn sáng chế năm 2025 và 2026; 9 văn bằng, trong đó 5 kiểu dáng công nghiệp và nhãn hiệu từ chiến lược hợp tác doanh nghiệp mà Ban Giám hiệu đã dày công kết nối.</w:t>
             </w:r>
           </w:p>
           <w:p>
@@ -21168,6 +21168,34 @@
           <w:i/>
         </w:rPr>
         <w:t xml:space="preserve">Quyết định số 217/QĐ-ĐHTĐ ngày 21 tháng 11 năm 2024 ban hành Quy chế quản trị tài sản trí tuệ tại Trường Đại học Thành Đô</w:t>
+      </w:r>
+      <w:r>
+        <w:rPr>
+          <w:szCs w:val="26"/>
+        </w:rPr>
+        <w:t xml:space="preserve">.</w:t>
+      </w:r>
+    </w:p>
+    <w:p>
+      <w:pPr>
+        <w:spacing w:after="80"/>
+        <w:ind w:left="560" w:hanging="560"/>
+        <w:rPr>
+          <w:szCs w:val="26"/>
+        </w:rPr>
+      </w:pPr>
+      <w:r>
+        <w:rPr>
+          <w:szCs w:val="26"/>
+        </w:rPr>
+        <w:t xml:space="preserve">Trường Đại học Thành Đô. (2025). </w:t>
+      </w:r>
+      <w:r>
+        <w:rPr>
+          <w:szCs w:val="26"/>
+          <w:i/>
+        </w:rPr>
+        <w:t xml:space="preserve">Điều lệ Quỹ Học bổng sau tiến sĩ Ngô Xuân Độ</w:t>
       </w:r>
       <w:r>
         <w:rPr>

</xml_diff>

<commit_message>
Bài báo phương án phân tích chính sách chỉ dùng văn bản công khai; giữ bài dùng số liệu nội bộ làm dự phòng; sắp xếp tài liệu theo chữ cái tiếng Việt
Co-Authored-By: Claude Opus 5.5 <noreply@anthropic.com>
Claude-Session: https://claude.ai/code/session_01ThGArqDrUUsqC1zG1BQvVL
</commit_message>
<xml_diff>
--- a/Ban_cuoi/Bao_cao_tong_ket_de_tai.docx
+++ b/Ban_cuoi/Bao_cao_tong_ket_de_tai.docx
@@ -20915,7 +20915,7 @@
           <w:szCs w:val="26"/>
           <w:i/>
         </w:rPr>
-        <w:t xml:space="preserve">Luật Khoa học, công nghệ và đổi mới sáng tạo số 93/2025/QH15 ngày 27 tháng 6 năm 2025</w:t>
+        <w:t xml:space="preserve">Luật Giáo dục đại học số 125/2025/QH15 ngày 10 tháng 12 năm 2025</w:t>
       </w:r>
       <w:r>
         <w:rPr>
@@ -20943,7 +20943,7 @@
           <w:szCs w:val="26"/>
           <w:i/>
         </w:rPr>
-        <w:t xml:space="preserve">Luật số 123/2025/QH15 ngày 10 tháng 12 năm 2025 sửa đổi, bổ sung một số điều của Luật Giáo dục</w:t>
+        <w:t xml:space="preserve">Luật Khoa học, công nghệ và đổi mới sáng tạo số 93/2025/QH15 ngày 27 tháng 6 năm 2025</w:t>
       </w:r>
       <w:r>
         <w:rPr>
@@ -20971,7 +20971,7 @@
           <w:szCs w:val="26"/>
           <w:i/>
         </w:rPr>
-        <w:t xml:space="preserve">Luật Giáo dục đại học số 125/2025/QH15 ngày 10 tháng 12 năm 2025</w:t>
+        <w:t xml:space="preserve">Luật số 123/2025/QH15 ngày 10 tháng 12 năm 2025 sửa đổi, bổ sung một số điều của Luật Giáo dục</w:t>
       </w:r>
       <w:r>
         <w:rPr>

</xml_diff>